<commit_message>
Ajout 3 LM Session 2 - Univ. Lille - mention BTS CIEL obtenu en 2026
</commit_message>
<xml_diff>
--- a/session 2 candidatures/docx/LM_L2_Informatique_Lille_Session2.docx
+++ b/session 2 candidatures/docx/LM_L2_Informatique_Lille_Session2.docx
@@ -4,7 +4,7 @@
   <w:body>
     <w:p>
       <w:pPr>
-        <w:spacing w:after="30" w:before="0"/>
+        <w:spacing w:after="30"/>
         <w:jc w:val="center"/>
       </w:pPr>
       <w:r>
@@ -21,7 +21,7 @@
     </w:p>
     <w:p>
       <w:pPr>
-        <w:spacing w:after="30" w:before="0"/>
+        <w:spacing w:after="30"/>
         <w:jc w:val="center"/>
       </w:pPr>
       <w:r>
@@ -33,7 +33,7 @@
           <w:sz w:val="22"/>
           <w:szCs w:val="22"/>
         </w:rPr>
-        <w:t xml:space="preserve">Étudiant BTS CIEL — Option B : Électronique et Réseaux</w:t>
+        <w:t xml:space="preserve">Titulaire du BTS CIEL — Option B : Électronique et Réseaux</w:t>
       </w:r>
     </w:p>
     <w:tbl>
@@ -200,7 +200,7 @@
     </w:p>
     <w:p>
       <w:pPr>
-        <w:spacing w:after="220" w:before="0"/>
+        <w:spacing w:after="220"/>
       </w:pPr>
       <w:r>
         <w:rPr>
@@ -251,7 +251,7 @@
           <w:sz w:val="21"/>
           <w:szCs w:val="21"/>
         </w:rPr>
-        <w:t xml:space="preserve">Actuellement en deuxième année de </w:t>
+        <w:t xml:space="preserve">Titulaire du </w:t>
       </w:r>
       <w:r>
         <w:rPr>
@@ -273,7 +273,7 @@
           <w:sz w:val="21"/>
           <w:szCs w:val="21"/>
         </w:rPr>
-        <w:t xml:space="preserve"> au LGT Baggio à Lille, où j'ai obtenu une moyenne générale de </w:t>
+        <w:t xml:space="preserve"> obtenu au LGT Baggio à Lille en 2026, avec une moyenne générale de </w:t>
       </w:r>
       <w:r>
         <w:rPr>
@@ -400,7 +400,7 @@
           <w:sz w:val="21"/>
           <w:szCs w:val="21"/>
         </w:rPr>
-        <w:t xml:space="preserve">). Souhaitant renforcer mes compétences en systèmes et réseaux, je me suis réorienté vers un BTS CIEL, où j'ai approfondi l'administration Linux/Windows, la sécurisation de réseaux (firewall, VLANs) et le déploiement d'équipements communicants.</w:t>
+        <w:t xml:space="preserve">). Souhaitant renforcer mes compétences en systèmes et réseaux, je me suis réorienté vers un BTS CIEL, où j'ai approfondi l'administration Linux/Windows, la sécurisation de réseaux (firewall, VLANs) et le déploiement d'équipements communicants — formation que je viens de valider avec succès.</w:t>
       </w:r>
     </w:p>
     <w:p>
@@ -473,7 +473,7 @@
           <w:sz w:val="21"/>
           <w:szCs w:val="21"/>
         </w:rPr>
-        <w:t xml:space="preserve">Sérieux, curieux et persévérant — qualités soulignées par mes professeurs — je m'investis également en dehors du cadre scolaire : je pratique des labs réseaux personnels encadrés par un expert en cybersécurité, et j'assure une veille technologique régulière. Le tennis, que je pratique en compétition depuis dix ans, m'a par ailleurs appris la rigueur et la persévérance face à l'effort long.</w:t>
+        <w:t xml:space="preserve">Fort d'un caractère sérieux, curieux et persévérant — qualités soulignées par mes professeurs —, je m'investis également en dehors du cadre scolaire : je pratique des labs réseaux personnels encadrés par un expert en cybersécurité, et j'assure une veille technologique régulière. Le tennis, que je pratique en compétition depuis dix ans, m'a par ailleurs appris la rigueur et la persévérance face à l'effort long.</w:t>
       </w:r>
     </w:p>
     <w:p>
@@ -585,7 +585,7 @@
       <w:pBdr>
         <w:top w:val="single" w:color="2E86C1" w:sz="6" w:space="3"/>
       </w:pBdr>
-      <w:spacing w:after="60" w:before="0"/>
+      <w:spacing w:after="60"/>
     </w:pPr>
   </w:p>
   <w:p>

</xml_diff>